<commit_message>
Stage 7 partial edit: consistency fixes, editing report, rebuilt Word file
Co-Authored-By: Claude Opus 5.5 <noreply@anthropic.com>
Claude-Session: https://claude.ai/code/session_01WqiczRbpYSe79U2iGsD9Wx
</commit_message>
<xml_diff>
--- a/thesis/Thesis_Draft_Ch1-3_for_Supervisor_Review.docx
+++ b/thesis/Thesis_Draft_Ch1-3_for_Supervisor_Review.docx
@@ -435,7 +435,7 @@
         <w:ind w:firstLine="720"/>
       </w:pPr>
       <w:r>
-        <w:t xml:space="preserve">This study examines that question through one significant political event: the passage of the Constitution (Twenty-sixth Amendment) Act, 2024. The amendment was passed by the Senate on 20 October 2024 with 65 votes in favour and four against, and by the National Assembly in a late-night session that ended in the early hours of 21 October 2024, when the government obtained 225 votes against the 224 required ("26th Constitutional Amendment awaits presidential assent," 2024) </w:t>
+        <w:t xml:space="preserve">This study examines that question through one significant political event: the passage of the Constitution (Twenty-sixth Amendment) Act, 2024. The Senate passed the amendment on 20 October 2024 with 65 votes in favour and four against. The National Assembly followed in a late-night session that ended in the early hours of 21 October 2024, when the government obtained 225 votes against the 224 required ("26th Constitutional Amendment awaits presidential assent," 2024) </w:t>
       </w:r>
       <w:r>
         <w:rPr>
@@ -445,7 +445,7 @@
         <w:t xml:space="preserve">[VERIFY: byline and date of the Dawn report]</w:t>
       </w:r>
       <w:r>
-        <w:t xml:space="preserve">. The President gave assent on the same day. The amendment changed the way the Chief Justice of Pakistan is appointed, giving a special parliamentary committee the power to select the Chief Justice from among the three most senior judges of the Supreme Court; it fixed the Chief Justice's tenure at three years, created constitutional benches in the superior courts and added parliamentarians to the Judicial Commission of Pakistan ("Explainer: What are 'judicial reforms'," 2024). The government presented these changes as judicial reform, while the Pakistan Tehreek-e-Insaf (PTI) opposition refused to support the bill, and international bodies such as the International Commission of Jurists described the amendment as a threat to judicial independence </w:t>
+        <w:t xml:space="preserve">. The President gave assent on the same day. The amendment changed the way the Chief Justice of Pakistan is appointed: a special parliamentary committee now selects the Chief Justice from among the three most senior judges of the Supreme Court. It also fixed the Chief Justice's tenure at three years, created constitutional benches in the superior courts and added parliamentarians to the Judicial Commission of Pakistan ("Explainer: What are 'judicial reforms'," 2024). The government presented these changes as judicial reform, while the Pakistan Tehreek-e-Insaf (PTI) opposition refused to support the bill, and international bodies such as the International Commission of Jurists described the amendment as a threat to judicial independence </w:t>
       </w:r>
       <w:r>
         <w:rPr>
@@ -770,7 +770,17 @@
         <w:ind w:firstLine="720"/>
       </w:pPr>
       <w:r>
-        <w:t xml:space="preserve">Socially, the study is relevant to readers. A growing share of political information in Pakistan reaches the public through online platforms rather than printed newspapers (Yusuf, 2013). Understanding whether these platforms present political events differently can help readers approach news more critically and recognise that every report, whatever its medium, involves choices.</w:t>
+        <w:t xml:space="preserve">Socially, the study is relevant to readers. A growing share of political information in Pakistan reaches the public through online platforms rather than printed newspapers (Yusuf, 2013) </w:t>
+      </w:r>
+      <w:r>
+        <w:rPr>
+          <w:highlight w:val="yellow"/>
+          <w:highlightCs w:val="yellow"/>
+        </w:rPr>
+        <w:t xml:space="preserve">[CHECK: add a more recent source on news consumption in Pakistan]</w:t>
+      </w:r>
+      <w:r>
+        <w:t xml:space="preserve">. Understanding whether these platforms present political events differently can help readers approach news more critically and recognise that every report, whatever its medium, involves choices.</w:t>
       </w:r>
     </w:p>
     <w:p>
@@ -1957,7 +1967,7 @@
         <w:t xml:space="preserve">[ABSTRACT ONLY — add findings after reading]</w:t>
       </w:r>
       <w:r>
-        <w:t xml:space="preserve">. Butool et al. (2021) analysed 25 headlines about the Pakistan Democratic Movement and, drawing on the ideological square, reported that the same political issue was framed differently across newspapers: according to the study, </w:t>
+        <w:t xml:space="preserve">. Butool et al. (2021) analysed 25 headlines about the Pakistan Democratic Movement, drawing on the ideological square. They reported that the same political issue was framed differently across newspapers: according to the study, </w:t>
       </w:r>
       <w:r>
         <w:rPr>
@@ -2370,7 +2380,7 @@
         <w:t xml:space="preserve">Dawn</w:t>
       </w:r>
       <w:r>
-        <w:t xml:space="preserve">, one of Pakistan's leading English-language daily newspapers. Only reports that appeared in its print edition are included. On Dawn.com, such reports are identified by the line "Published in Dawn" followed by the date; stories published only on the website are excluded, because including them would blur the distinction between print and digital media on which the comparison depends.</w:t>
+        <w:t xml:space="preserve">, a long-established English-language daily newspaper. Only reports that appeared in its print edition are included. On Dawn.com, such reports are identified by the line "Published in Dawn" followed by the date; stories published only on the website are excluded, because including them would blur the distinction between print and digital media on which the comparison depends.</w:t>
       </w:r>
     </w:p>
     <w:p>

</xml_diff>